<commit_message>
laeb adversary-complaint, motion-brief: typst and docx on the shared cross-engine layout model; docx/build-reference.sh and reference.docx give way to docx/reference.xml (base="xengine", {font} Times New Roman, was EB Garamond); block quotations single-spaced in both engines as in the exemplar; the motion's U+2010 hyphen set as a hyphen; docx XENG-001..003 pass (243/243, 266/266 lines), params.cross_engine: gate (fb-595.68.13)
</commit_message>
<xml_diff>
--- a/courts/fifth-circuit/louisiana/federal/bankruptcy-eastern-district/adversary-complaint/usage/OUTPUT-adversary-complaint.docx
+++ b/courts/fifth-circuit/louisiana/federal/bankruptcy-eastern-district/adversary-complaint/usage/OUTPUT-adversary-complaint.docx
@@ -4,43 +4,53 @@
   <w:body>
     <w:p>
       <w:pPr>
-        <w:pStyle w:val="CourtTitle"/>
-      </w:pPr>
-      <w:r>
+        <w:spacing w:before="0" w:after="0" w:line="276" w:lineRule="exact"/>
+        <w:ind w:left="0" w:firstLine="0"/>
+        <w:jc w:val="center"/>
+      </w:pPr>
+      <w:r>
+        <w:rPr>
+          <w:b/>
+          <w:bCs/>
+        </w:rPr>
         <w:t xml:space="preserve">UNITED STATES BANKRUPTCY COURT</w:t>
       </w:r>
     </w:p>
     <w:p>
       <w:pPr>
-        <w:pStyle w:val="CourtTitle"/>
-        <w:spacing w:after="200"/>
-      </w:pPr>
-      <w:r>
+        <w:spacing w:before="0" w:after="0" w:line="276" w:lineRule="exact"/>
+        <w:ind w:left="0" w:firstLine="0"/>
+        <w:jc w:val="center"/>
+      </w:pPr>
+      <w:r>
+        <w:rPr>
+          <w:b/>
+          <w:bCs/>
+        </w:rPr>
         <w:t xml:space="preserve">EASTERN DISTRICT OF LOUISIANA</w:t>
       </w:r>
+    </w:p>
+    <w:p>
+      <w:pPr>
+        <w:spacing w:before="0" w:after="0" w:line="240" w:lineRule="exact"/>
+      </w:pPr>
     </w:p>
     <w:tbl>
       <w:tblPr>
         <w:tblW w:w="9360" w:type="dxa"/>
-        <w:tblInd w:w="0" w:type="dxa"/>
-        <w:tblBorders>
-          <w:top w:val="nil"/>
-          <w:left w:val="nil"/>
-          <w:bottom w:val="nil"/>
-          <w:right w:val="nil"/>
-          <w:insideH w:val="nil"/>
-          <w:insideV w:val="nil"/>
-        </w:tblBorders>
         <w:tblLayout w:type="fixed"/>
         <w:tblCellMar>
+          <w:top w:w="0" w:type="dxa"/>
           <w:left w:w="0" w:type="dxa"/>
+          <w:bottom w:w="0" w:type="dxa"/>
           <w:right w:w="0" w:type="dxa"/>
         </w:tblCellMar>
-        <w:tblLook w:val="0000"/>
+        <w:tblLook w:val="0000" w:firstRow="0" w:lastRow="0" w:firstColumn="0" w:lastColumn="0" w:noHBand="0" w:noVBand="0"/>
       </w:tblPr>
       <w:tblGrid>
         <w:gridCol w:w="4896"/>
-        <w:gridCol w:w="4464"/>
+        <w:gridCol w:w="360"/>
+        <w:gridCol w:w="4104"/>
       </w:tblGrid>
       <w:tr>
         <w:tc>
@@ -56,7 +66,9 @@
           </w:tcPr>
           <w:p>
             <w:pPr>
-              <w:pStyle w:val="CaptionText"/>
+              <w:spacing w:before="0" w:after="0" w:line="276" w:lineRule="exact"/>
+              <w:ind w:left="0" w:firstLine="0"/>
+              <w:jc w:val="left"/>
             </w:pPr>
             <w:r>
               <w:t xml:space="preserve">In</w:t>
@@ -70,7 +82,9 @@
           </w:p>
           <w:p>
             <w:pPr>
-              <w:pStyle w:val="CaptionText"/>
+              <w:spacing w:before="0" w:after="0" w:line="276" w:lineRule="exact"/>
+              <w:ind w:left="0" w:firstLine="0"/>
+              <w:jc w:val="left"/>
             </w:pPr>
             <w:r>
               <w:t xml:space="preserve">Martin</w:t>
@@ -90,7 +104,9 @@
           </w:p>
           <w:p>
             <w:pPr>
-              <w:pStyle w:val="CaptionDesignation"/>
+              <w:spacing w:before="0" w:after="0" w:line="276" w:lineRule="exact"/>
+              <w:ind w:left="2304" w:firstLine="0"/>
+              <w:jc w:val="left"/>
             </w:pPr>
             <w:r>
               <w:t xml:space="preserve">Debtor</w:t>
@@ -98,119 +114,119 @@
           </w:p>
           <w:p>
             <w:pPr>
-              <w:pStyle w:val="CaptionText"/>
-              <w:spacing w:line="120" w:lineRule="exact"/>
+              <w:spacing w:before="276" w:after="0" w:line="276" w:lineRule="exact"/>
+              <w:ind w:left="0" w:firstLine="0"/>
+              <w:jc w:val="left"/>
             </w:pPr>
+            <w:r>
+              <w:t xml:space="preserve">Martin</w:t>
+            </w:r>
+            <w:r>
+              <w:t xml:space="preserve"> </w:t>
+            </w:r>
+            <w:r>
+              <w:t xml:space="preserve">Energy,</w:t>
+            </w:r>
+            <w:r>
+              <w:t xml:space="preserve"> </w:t>
+            </w:r>
+            <w:r>
+              <w:t xml:space="preserve">LLC</w:t>
+            </w:r>
           </w:p>
           <w:p>
             <w:pPr>
-              <w:pStyle w:val="CaptionText"/>
+              <w:spacing w:before="0" w:after="0" w:line="276" w:lineRule="exact"/>
+              <w:ind w:left="2304" w:firstLine="0"/>
+              <w:jc w:val="left"/>
             </w:pPr>
             <w:r>
-              <w:t xml:space="preserve">Martin</w:t>
-            </w:r>
-            <w:r>
-              <w:t xml:space="preserve"> </w:t>
-            </w:r>
-            <w:r>
-              <w:t xml:space="preserve">Energy,</w:t>
-            </w:r>
-            <w:r>
-              <w:t xml:space="preserve"> </w:t>
-            </w:r>
-            <w:r>
-              <w:t xml:space="preserve">LLC</w:t>
+              <w:t xml:space="preserve">Plaintiff</w:t>
             </w:r>
           </w:p>
           <w:p>
             <w:pPr>
-              <w:pStyle w:val="CaptionDesignation"/>
+              <w:spacing w:before="276" w:after="0" w:line="276" w:lineRule="exact"/>
+              <w:ind w:left="0" w:firstLine="0"/>
+              <w:jc w:val="left"/>
             </w:pPr>
             <w:r>
-              <w:t xml:space="preserve">Plaintiff</w:t>
+              <w:t xml:space="preserve">v.</w:t>
             </w:r>
           </w:p>
           <w:p>
             <w:pPr>
-              <w:pStyle w:val="CaptionText"/>
-              <w:spacing w:line="120" w:lineRule="exact"/>
+              <w:spacing w:before="0" w:after="0" w:line="276" w:lineRule="exact"/>
+              <w:ind w:left="0" w:firstLine="0"/>
+              <w:jc w:val="left"/>
             </w:pPr>
+            <w:r>
+              <w:t xml:space="preserve">Crescent</w:t>
+            </w:r>
+            <w:r>
+              <w:t xml:space="preserve"> </w:t>
+            </w:r>
+            <w:r>
+              <w:t xml:space="preserve">Drilling</w:t>
+            </w:r>
+            <w:r>
+              <w:t xml:space="preserve"> </w:t>
+            </w:r>
+            <w:r>
+              <w:t xml:space="preserve">&amp;</w:t>
+            </w:r>
+            <w:r>
+              <w:t xml:space="preserve"> </w:t>
+            </w:r>
+            <w:r>
+              <w:t xml:space="preserve">Production,</w:t>
+            </w:r>
+            <w:r>
+              <w:t xml:space="preserve"> </w:t>
+            </w:r>
+            <w:r>
+              <w:t xml:space="preserve">Inc.,</w:t>
+            </w:r>
+            <w:r>
+              <w:t xml:space="preserve"> </w:t>
+            </w:r>
+            <w:r>
+              <w:t xml:space="preserve">and</w:t>
+            </w:r>
           </w:p>
           <w:p>
             <w:pPr>
-              <w:pStyle w:val="CaptionText"/>
+              <w:spacing w:before="0" w:after="0" w:line="276" w:lineRule="exact"/>
+              <w:ind w:left="0" w:firstLine="0"/>
+              <w:jc w:val="left"/>
             </w:pPr>
             <w:r>
-              <w:t xml:space="preserve">v.</w:t>
+              <w:t xml:space="preserve">Crescent</w:t>
+            </w:r>
+            <w:r>
+              <w:t xml:space="preserve"> </w:t>
+            </w:r>
+            <w:r>
+              <w:t xml:space="preserve">Drilling</w:t>
+            </w:r>
+            <w:r>
+              <w:t xml:space="preserve"> </w:t>
+            </w:r>
+            <w:r>
+              <w:t xml:space="preserve">Foreman,</w:t>
+            </w:r>
+            <w:r>
+              <w:t xml:space="preserve"> </w:t>
+            </w:r>
+            <w:r>
+              <w:t xml:space="preserve">Inc.</w:t>
             </w:r>
           </w:p>
           <w:p>
             <w:pPr>
-              <w:pStyle w:val="CaptionText"/>
-            </w:pPr>
-            <w:r>
-              <w:t xml:space="preserve">Crescent</w:t>
-            </w:r>
-            <w:r>
-              <w:t xml:space="preserve"> </w:t>
-            </w:r>
-            <w:r>
-              <w:t xml:space="preserve">Drilling</w:t>
-            </w:r>
-            <w:r>
-              <w:t xml:space="preserve"> </w:t>
-            </w:r>
-            <w:r>
-              <w:t xml:space="preserve">&amp;</w:t>
-            </w:r>
-            <w:r>
-              <w:t xml:space="preserve"> </w:t>
-            </w:r>
-            <w:r>
-              <w:t xml:space="preserve">Production,</w:t>
-            </w:r>
-            <w:r>
-              <w:t xml:space="preserve"> </w:t>
-            </w:r>
-            <w:r>
-              <w:t xml:space="preserve">Inc.,</w:t>
-            </w:r>
-            <w:r>
-              <w:t xml:space="preserve"> </w:t>
-            </w:r>
-            <w:r>
-              <w:t xml:space="preserve">and</w:t>
-            </w:r>
-          </w:p>
-          <w:p>
-            <w:pPr>
-              <w:pStyle w:val="CaptionText"/>
-            </w:pPr>
-            <w:r>
-              <w:t xml:space="preserve">Crescent</w:t>
-            </w:r>
-            <w:r>
-              <w:t xml:space="preserve"> </w:t>
-            </w:r>
-            <w:r>
-              <w:t xml:space="preserve">Drilling</w:t>
-            </w:r>
-            <w:r>
-              <w:t xml:space="preserve"> </w:t>
-            </w:r>
-            <w:r>
-              <w:t xml:space="preserve">Foreman,</w:t>
-            </w:r>
-            <w:r>
-              <w:t xml:space="preserve"> </w:t>
-            </w:r>
-            <w:r>
-              <w:t xml:space="preserve">Inc.</w:t>
-            </w:r>
-          </w:p>
-          <w:p>
-            <w:pPr>
-              <w:pStyle w:val="CaptionDesignation"/>
+              <w:spacing w:before="0" w:after="0" w:line="276" w:lineRule="exact"/>
+              <w:ind w:left="2304" w:firstLine="0"/>
+              <w:jc w:val="left"/>
             </w:pPr>
             <w:r>
               <w:t xml:space="preserve">Defendants</w:t>
@@ -219,12 +235,29 @@
         </w:tc>
         <w:tc>
           <w:tcPr>
-            <w:tcW w:w="4464" w:type="dxa"/>
+            <w:tcW w:w="360" w:type="dxa"/>
           </w:tcPr>
           <w:p>
             <w:pPr>
-              <w:pStyle w:val="CaptionCase"/>
+              <w:spacing w:before="0" w:after="0" w:line="276" w:lineRule="exact"/>
+              <w:ind w:left="0" w:firstLine="0"/>
+              <w:jc w:val="left"/>
             </w:pPr>
+          </w:p>
+        </w:tc>
+        <w:tc>
+          <w:tcPr>
+            <w:tcW w:w="4104" w:type="dxa"/>
+            <w:tcMar>
+              <w:left w:w="144" w:type="dxa"/>
+            </w:tcMar>
+          </w:tcPr>
+          <w:p>
+            <w:pPr>
+              <w:spacing w:before="0" w:after="0" w:line="276" w:lineRule="exact"/>
+              <w:ind w:left="0" w:firstLine="0"/>
+              <w:jc w:val="left"/>
+            </w:pPr>
             <w:r>
               <w:t xml:space="preserve">Case</w:t>
             </w:r>
@@ -232,12 +265,22 @@
               <w:t xml:space="preserve"> </w:t>
             </w:r>
             <w:r>
-              <w:t xml:space="preserve">No. 23-10898</w:t>
+              <w:t xml:space="preserve">No.</w:t>
+            </w:r>
+            <w:r>
+              <w:t xml:space="preserve"> </w:t>
+            </w:r>
+            <w:r>
+              <w:t xml:space="preserve">23</w:t>
+              <w:noBreakHyphen/>
+              <w:t xml:space="preserve">10898</w:t>
             </w:r>
           </w:p>
           <w:p>
             <w:pPr>
-              <w:pStyle w:val="CaptionCase"/>
+              <w:spacing w:before="0" w:after="0" w:line="276" w:lineRule="exact"/>
+              <w:ind w:left="0" w:firstLine="0"/>
+              <w:jc w:val="left"/>
             </w:pPr>
             <w:r>
               <w:t xml:space="preserve">Chapter</w:t>
@@ -251,7 +294,9 @@
           </w:p>
           <w:p>
             <w:pPr>
-              <w:pStyle w:val="CaptionCase"/>
+              <w:spacing w:before="0" w:after="0" w:line="276" w:lineRule="exact"/>
+              <w:ind w:left="0" w:firstLine="0"/>
+              <w:jc w:val="left"/>
             </w:pPr>
             <w:r>
               <w:t xml:space="preserve">Section</w:t>
@@ -265,7 +310,9 @@
           </w:p>
           <w:p>
             <w:pPr>
-              <w:pStyle w:val="CaptionCase"/>
+              <w:spacing w:before="0" w:after="0" w:line="276" w:lineRule="exact"/>
+              <w:ind w:left="0" w:firstLine="0"/>
+              <w:jc w:val="left"/>
             </w:pPr>
             <w:r>
               <w:t xml:space="preserve">Adv.</w:t>
@@ -274,7 +321,13 @@
               <w:t xml:space="preserve"> </w:t>
             </w:r>
             <w:r>
-              <w:t xml:space="preserve">No. 24-______</w:t>
+              <w:t xml:space="preserve">No.</w:t>
+            </w:r>
+            <w:r>
+              <w:t xml:space="preserve"> </w:t>
+            </w:r>
+            <w:r>
+              <w:t xml:space="preserve">24-______</w:t>
             </w:r>
           </w:p>
         </w:tc>
@@ -282,9 +335,17 @@
     </w:tbl>
     <w:p>
       <w:pPr>
-        <w:pStyle w:val="PleadingTitle"/>
-      </w:pPr>
-      <w:r>
+        <w:keepNext/>
+        <w:keepLines/>
+        <w:spacing w:before="240" w:after="240" w:line="276" w:lineRule="exact"/>
+        <w:ind w:left="0" w:firstLine="0"/>
+        <w:jc w:val="center"/>
+      </w:pPr>
+      <w:r>
+        <w:rPr>
+          <w:b/>
+          <w:bCs/>
+        </w:rPr>
         <w:t xml:space="preserve">COMPLAINT</w:t>
       </w:r>
     </w:p>
@@ -293,286 +354,20 @@
         <w:pStyle w:val="BodyText"/>
       </w:pPr>
       <w:r>
-        <w:t xml:space="preserve">NOW</w:t>
-      </w:r>
-      <w:r>
-        <w:t xml:space="preserve"> </w:t>
-      </w:r>
-      <w:r>
-        <w:t xml:space="preserve">INTO</w:t>
-      </w:r>
-      <w:r>
-        <w:t xml:space="preserve"> </w:t>
-      </w:r>
-      <w:r>
-        <w:t xml:space="preserve">COURT,</w:t>
-      </w:r>
-      <w:r>
-        <w:t xml:space="preserve"> </w:t>
-      </w:r>
-      <w:r>
-        <w:t xml:space="preserve">through</w:t>
-      </w:r>
-      <w:r>
-        <w:t xml:space="preserve"> </w:t>
-      </w:r>
-      <w:r>
-        <w:t xml:space="preserve">undersigned</w:t>
-      </w:r>
-      <w:r>
-        <w:t xml:space="preserve"> </w:t>
-      </w:r>
-      <w:r>
-        <w:t xml:space="preserve">counsel</w:t>
-      </w:r>
-      <w:r>
-        <w:t xml:space="preserve"> </w:t>
-      </w:r>
-      <w:r>
-        <w:t xml:space="preserve">comes</w:t>
-      </w:r>
-      <w:r>
-        <w:t xml:space="preserve"> </w:t>
-      </w:r>
-      <w:r>
-        <w:t xml:space="preserve">Wilbur</w:t>
-      </w:r>
-      <w:r>
-        <w:t xml:space="preserve"> </w:t>
-      </w:r>
-      <w:r>
-        <w:t xml:space="preserve">J.</w:t>
-      </w:r>
-      <w:r>
-        <w:t xml:space="preserve"> </w:t>
-      </w:r>
-      <w:r>
-        <w:t xml:space="preserve">“Bill”</w:t>
-      </w:r>
-      <w:r>
-        <w:t xml:space="preserve"> </w:t>
-      </w:r>
-      <w:r>
-        <w:t xml:space="preserve">Babin,</w:t>
-      </w:r>
-      <w:r>
-        <w:t xml:space="preserve"> </w:t>
-      </w:r>
-      <w:r>
-        <w:t xml:space="preserve">Jr.,</w:t>
-      </w:r>
-      <w:r>
-        <w:t xml:space="preserve"> </w:t>
-      </w:r>
-      <w:r>
-        <w:t xml:space="preserve">solely</w:t>
-      </w:r>
-      <w:r>
-        <w:t xml:space="preserve"> </w:t>
-      </w:r>
-      <w:r>
-        <w:t xml:space="preserve">in</w:t>
-      </w:r>
-      <w:r>
-        <w:t xml:space="preserve"> </w:t>
-      </w:r>
-      <w:r>
-        <w:t xml:space="preserve">his</w:t>
-      </w:r>
-      <w:r>
-        <w:t xml:space="preserve"> </w:t>
-      </w:r>
-      <w:r>
-        <w:t xml:space="preserve">capacity</w:t>
-      </w:r>
-      <w:r>
-        <w:t xml:space="preserve"> </w:t>
-      </w:r>
-      <w:r>
-        <w:t xml:space="preserve">as</w:t>
-      </w:r>
-      <w:r>
-        <w:t xml:space="preserve"> </w:t>
-      </w:r>
-      <w:r>
-        <w:t xml:space="preserve">duly</w:t>
-      </w:r>
-      <w:r>
-        <w:t xml:space="preserve"> </w:t>
-      </w:r>
-      <w:r>
-        <w:t xml:space="preserve">appointed</w:t>
-      </w:r>
-      <w:r>
-        <w:t xml:space="preserve"> </w:t>
-      </w:r>
-      <w:r>
-        <w:t xml:space="preserve">trustee</w:t>
-      </w:r>
-      <w:r>
-        <w:t xml:space="preserve"> </w:t>
-      </w:r>
-      <w:r>
-        <w:t xml:space="preserve">for</w:t>
-      </w:r>
-      <w:r>
-        <w:t xml:space="preserve"> </w:t>
-      </w:r>
-      <w:r>
-        <w:t xml:space="preserve">the</w:t>
-      </w:r>
-      <w:r>
-        <w:t xml:space="preserve"> </w:t>
-      </w:r>
-      <w:r>
-        <w:t xml:space="preserve">above</w:t>
-      </w:r>
-      <w:r>
-        <w:t xml:space="preserve"> </w:t>
-      </w:r>
-      <w:r>
-        <w:t xml:space="preserve">captioned</w:t>
-      </w:r>
-      <w:r>
-        <w:t xml:space="preserve"> </w:t>
-      </w:r>
-      <w:r>
-        <w:t xml:space="preserve">Chapter</w:t>
-      </w:r>
-      <w:r>
-        <w:t xml:space="preserve"> </w:t>
-      </w:r>
-      <w:r>
-        <w:t xml:space="preserve">7</w:t>
-      </w:r>
-      <w:r>
-        <w:t xml:space="preserve"> </w:t>
-      </w:r>
-      <w:r>
-        <w:t xml:space="preserve">estate</w:t>
-      </w:r>
-      <w:r>
-        <w:t xml:space="preserve"> </w:t>
-      </w:r>
-      <w:r>
-        <w:t xml:space="preserve">(“Trustee”</w:t>
-      </w:r>
-      <w:r>
-        <w:t xml:space="preserve"> </w:t>
-      </w:r>
-      <w:r>
-        <w:t xml:space="preserve">or</w:t>
-      </w:r>
-      <w:r>
-        <w:t xml:space="preserve"> </w:t>
-      </w:r>
-      <w:r>
-        <w:t xml:space="preserve">the</w:t>
-      </w:r>
-      <w:r>
-        <w:t xml:space="preserve"> </w:t>
-      </w:r>
-      <w:r>
-        <w:t xml:space="preserve">“Plaintiff”)</w:t>
-      </w:r>
-      <w:r>
-        <w:t xml:space="preserve"> </w:t>
-      </w:r>
-      <w:r>
-        <w:t xml:space="preserve">who</w:t>
-      </w:r>
-      <w:r>
-        <w:t xml:space="preserve"> </w:t>
-      </w:r>
-      <w:r>
-        <w:t xml:space="preserve">files</w:t>
-      </w:r>
-      <w:r>
-        <w:t xml:space="preserve"> </w:t>
-      </w:r>
-      <w:r>
-        <w:t xml:space="preserve">this</w:t>
-      </w:r>
-      <w:r>
-        <w:t xml:space="preserve"> </w:t>
-      </w:r>
-      <w:r>
-        <w:t xml:space="preserve">Complaint.</w:t>
-      </w:r>
-      <w:r>
-        <w:t xml:space="preserve"> </w:t>
-      </w:r>
-      <w:r>
-        <w:t xml:space="preserve">In</w:t>
-      </w:r>
-      <w:r>
-        <w:t xml:space="preserve"> </w:t>
-      </w:r>
-      <w:r>
-        <w:t xml:space="preserve">support</w:t>
-      </w:r>
-      <w:r>
-        <w:t xml:space="preserve"> </w:t>
-      </w:r>
-      <w:r>
-        <w:t xml:space="preserve">of</w:t>
-      </w:r>
-      <w:r>
-        <w:t xml:space="preserve"> </w:t>
-      </w:r>
-      <w:r>
-        <w:t xml:space="preserve">this</w:t>
-      </w:r>
-      <w:r>
-        <w:t xml:space="preserve"> </w:t>
-      </w:r>
-      <w:r>
-        <w:t xml:space="preserve">Complaint,</w:t>
-      </w:r>
-      <w:r>
-        <w:t xml:space="preserve"> </w:t>
-      </w:r>
-      <w:r>
-        <w:t xml:space="preserve">the</w:t>
-      </w:r>
-      <w:r>
-        <w:t xml:space="preserve"> </w:t>
-      </w:r>
-      <w:r>
-        <w:t xml:space="preserve">Plaintiff</w:t>
-      </w:r>
-      <w:r>
-        <w:t xml:space="preserve"> </w:t>
-      </w:r>
-      <w:r>
-        <w:t xml:space="preserve">represents</w:t>
-      </w:r>
-      <w:r>
-        <w:t xml:space="preserve"> </w:t>
-      </w:r>
-      <w:r>
-        <w:t xml:space="preserve">as</w:t>
-      </w:r>
-      <w:r>
-        <w:t xml:space="preserve"> </w:t>
-      </w:r>
-      <w:r>
-        <w:t xml:space="preserve">follows:</w:t>
+        <w:t xml:space="preserve">NOW INTO COURT, through undersigned counsel comes Wilbur J. “Bill” Babin, Jr., solely in his capacity as duly appointed trustee for the above captioned Chapter 7 estate (“Trustee” or the “Plaintiff”) who files this Complaint. In support of this Complaint, the Plaintiff represents as follows:</w:t>
       </w:r>
     </w:p>
     <w:p>
       <w:pPr>
         <w:pStyle w:val="Heading1"/>
       </w:pPr>
-      <w:bookmarkStart w:id="9" w:name="_0e2df9c0fe52ebd43073ce38f4076c822df9b17"/>
       <w:r>
         <w:t xml:space="preserve">JURISDICTION AND VENUE</w:t>
       </w:r>
-      <w:bookmarkEnd w:id="9"/>
-    </w:p>
-    <w:p>
-      <w:pPr>
-        <w:pStyle w:val="Allegation"/>
+    </w:p>
+    <w:p>
+      <w:pPr>
+        <w:pStyle w:val="NumberedParagraph"/>
       </w:pPr>
       <w:r>
         <w:t xml:space="preserve">1.</w:t>
@@ -581,12 +376,12 @@
         <w:tab/>
       </w:r>
       <w:r>
-        <w:t xml:space="preserve">The Court has jurisdiction over this matter pursuant to 28 U.S.C. §§ 157 and 1334. This matter is a core proceeding within the meaning of 28 U.S.C. § 157(b)(2)(A), (B), (C), (H), (K) and (O).</w:t>
-      </w:r>
-    </w:p>
-    <w:p>
-      <w:pPr>
-        <w:pStyle w:val="Allegation"/>
+        <w:t xml:space="preserve">The Court has jurisdiction over this matter pursuant to 28 U.S.C. §§ 157 and 1334. This matter is a core proceeding within the meaning of 28 U.S.C. § 157(b)⁠(2)⁠(A), (B), (C), (H), (K) and (O).</w:t>
+      </w:r>
+    </w:p>
+    <w:p>
+      <w:pPr>
+        <w:pStyle w:val="NumberedParagraph"/>
       </w:pPr>
       <w:r>
         <w:t xml:space="preserve">2.</w:t>
@@ -602,15 +397,13 @@
       <w:pPr>
         <w:pStyle w:val="Heading1"/>
       </w:pPr>
-      <w:bookmarkStart w:id="10" w:name="_11f40d06de0edd3a9fc61e6e200a5b73fb8147e"/>
       <w:r>
         <w:t xml:space="preserve">THE PARTIES</w:t>
       </w:r>
-      <w:bookmarkEnd w:id="10"/>
-    </w:p>
-    <w:p>
-      <w:pPr>
-        <w:pStyle w:val="Allegation"/>
+    </w:p>
+    <w:p>
+      <w:pPr>
+        <w:pStyle w:val="NumberedParagraph"/>
       </w:pPr>
       <w:r>
         <w:t xml:space="preserve">3.</w:t>
@@ -624,7 +417,7 @@
     </w:p>
     <w:p>
       <w:pPr>
-        <w:pStyle w:val="Allegation"/>
+        <w:pStyle w:val="NumberedParagraph"/>
       </w:pPr>
       <w:r>
         <w:t xml:space="preserve">4.</w:t>
@@ -638,7 +431,7 @@
     </w:p>
     <w:p>
       <w:pPr>
-        <w:pStyle w:val="Allegation"/>
+        <w:pStyle w:val="NumberedParagraph"/>
       </w:pPr>
       <w:r>
         <w:t xml:space="preserve">5.</w:t>
@@ -652,7 +445,7 @@
     </w:p>
     <w:p>
       <w:pPr>
-        <w:pStyle w:val="Allegation"/>
+        <w:pStyle w:val="NumberedParagraphNote"/>
       </w:pPr>
       <w:r>
         <w:t xml:space="preserve">6.</w:t>
@@ -667,28 +460,26 @@
         <w:rPr>
           <w:rStyle w:val="FootnoteReference"/>
         </w:rPr>
-        <w:footnoteReference w:id="11"/>
-      </w:r>
-      <w:r>
-        <w:t xml:space="preserve"> </w:t>
-      </w:r>
-      <w:r>
-        <w:t xml:space="preserve">each provide different services to clients. CDP provides services to the oil and gas industry from project commencement through completion. Those services include project management, production management, engineering, and accounting. CDF provides well-site supervisors for all phases of drilling, completion, workover, remedial work, and operations. The well-site supervisors include drilling and completion foremen, cased hole foremen, down hole tool specialists, mud/fluid specialists, project site security, and contract pumpers.</w:t>
+        <w:footnoteReference w:id="9"/>
+      </w:r>
+      <w:r>
+        <w:t xml:space="preserve"> </w:t>
+      </w:r>
+      <w:r>
+        <w:t xml:space="preserve">each provide different services to clients. CDP provides services to the oil and gas industry from project commencement through completion. Those services include project management, production management, engineering, and accounting. CDF provides well-site supervisors for all phases of drilling, completion, workover, remedial work, and operations. The well-site supervisors include drilling and completion foremen, cased hole foremen, down hole tool specialists, mud/​fluid specialists, project site security, and contract pumpers.</w:t>
       </w:r>
     </w:p>
     <w:p>
       <w:pPr>
         <w:pStyle w:val="Heading1"/>
       </w:pPr>
-      <w:bookmarkStart w:id="12" w:name="_fa718e5759d307a236f16396812517dfe4ef15c"/>
       <w:r>
         <w:t xml:space="preserve">FACTUAL &amp; PROCEDURAL BACKGROUND</w:t>
       </w:r>
-      <w:bookmarkEnd w:id="12"/>
-    </w:p>
-    <w:p>
-      <w:pPr>
-        <w:pStyle w:val="Allegation"/>
+    </w:p>
+    <w:p>
+      <w:pPr>
+        <w:pStyle w:val="NumberedParagraph"/>
       </w:pPr>
       <w:r>
         <w:t xml:space="preserve">7.</w:t>
@@ -702,7 +493,7 @@
     </w:p>
     <w:p>
       <w:pPr>
-        <w:pStyle w:val="Allegation"/>
+        <w:pStyle w:val="NumberedParagraph"/>
       </w:pPr>
       <w:r>
         <w:t xml:space="preserve">8.</w:t>
@@ -711,22 +502,20 @@
         <w:tab/>
       </w:r>
       <w:r>
-        <w:t xml:space="preserve">The Debtor is a Louisiana limited liability company that, on the Petition Date, owned interests in certain oil and gas wells. Based on information provided to the Trustee, the Debtor owned a 28.215972% working interest in the Haspel &amp; Davis Well 2, and 59.353318% working interest in the A0392 Well 3 (collectively “Wells”). Prior to the bankruptcy, the Debtor was the designated operator on both wells. Both wells have been non-producing since April 2023. Pre-petition claims have been asserted in the Bankruptcy Case in excess of $5 million by the various vendors and service companies who did work on the Wells. Many of these creditors have asserted oil and gas liens (and/or privileges) under the Louisiana Oil &amp; Gas Lien Act (“LOWLA”).</w:t>
+        <w:t xml:space="preserve">The Debtor is a Louisiana limited liability company that, on the Petition Date, owned interests in certain oil and gas wells. Based on information provided to the Trustee, the Debtor owned a 28.215972% working interest in the Haspel &amp; Davis Well 2, and 59.353318% working interest in the A0392 Well 3 (collectively “Wells”). Prior to the bankruptcy, the Debtor was the designated operator on both wells. Both wells have been non-producing since April 2023. Pre-petition claims have been asserted in the Bankruptcy Case in excess of $5 million by the various vendors and service companies who did work on the Wells. Many of these creditors have asserted oil and gas liens (and/​or privileges) under the Louisiana Oil &amp; Gas Lien Act (“LOWLA”).</w:t>
       </w:r>
     </w:p>
     <w:p>
       <w:pPr>
         <w:pStyle w:val="Heading2"/>
       </w:pPr>
-      <w:bookmarkStart w:id="13" w:name="_d6762a678fe7e18cb39e6e870baeeb95be2a7eb"/>
-      <w:r>
-        <w:t xml:space="preserve">The Crescent/Martin Relationship</w:t>
-      </w:r>
-      <w:bookmarkEnd w:id="13"/>
-    </w:p>
-    <w:p>
-      <w:pPr>
-        <w:pStyle w:val="Allegation"/>
+      <w:r>
+        <w:t xml:space="preserve">The Crescent/​Martin Relationship</w:t>
+      </w:r>
+    </w:p>
+    <w:p>
+      <w:pPr>
+        <w:pStyle w:val="NumberedParagraph"/>
       </w:pPr>
       <w:r>
         <w:t xml:space="preserve">9.</w:t>
@@ -735,12 +524,12 @@
         <w:tab/>
       </w:r>
       <w:r>
-        <w:t xml:space="preserve">On or about June 21, 2021, CDP and the Debtor entered into a Master Service Agreement (“MSA”) whereby CDP, along with its parent, subsidiaries, and affiliates (including CDF), agreed to provide services, labor, equipment, materials, supplies, and related services used in well operation, production and drilling in connection with the Debtor’s construction and/or operations of properties and facilities for the exploration, development and/or production of oil and gas at rates and costs agreed upon by the parties. A copy of the MSA is attached as Exhibit “A”.</w:t>
-      </w:r>
-    </w:p>
-    <w:p>
-      <w:pPr>
-        <w:pStyle w:val="Allegation"/>
+        <w:t xml:space="preserve">On or about June 21, 2021, CDP and the Debtor entered into a Master Service Agreement (“MSA”) whereby CDP, along with its parent, subsidiaries, and affiliates (including CDF), agreed to provide services, labor, equipment, materials, supplies, and related services used in well operation, production and drilling in connection with the Debtor’s construction and/​or operations of properties and facilities for the exploration, development and/​or production of oil and gas at rates and costs agreed upon by the parties. A copy of the MSA is attached as Exhibit “A”.</w:t>
+      </w:r>
+    </w:p>
+    <w:p>
+      <w:pPr>
+        <w:pStyle w:val="NumberedParagraph"/>
       </w:pPr>
       <w:r>
         <w:t xml:space="preserve">10.</w:t>
@@ -749,12 +538,12 @@
         <w:tab/>
       </w:r>
       <w:r>
-        <w:t xml:space="preserve">Under the MSA, CDP was obligated to perform all services in a good and workmanlike manner in accordance with good engineering and/or oil field practices.</w:t>
-      </w:r>
-    </w:p>
-    <w:p>
-      <w:pPr>
-        <w:pStyle w:val="Allegation"/>
+        <w:t xml:space="preserve">Under the MSA, CDP was obligated to perform all services in a good and workmanlike manner in accordance with good engineering and/​or oil field practices.</w:t>
+      </w:r>
+    </w:p>
+    <w:p>
+      <w:pPr>
+        <w:pStyle w:val="NumberedParagraph"/>
       </w:pPr>
       <w:r>
         <w:t xml:space="preserve">11.</w:t>
@@ -776,7 +565,7 @@
     </w:p>
     <w:p>
       <w:pPr>
-        <w:pStyle w:val="Allegation"/>
+        <w:pStyle w:val="NumberedParagraph"/>
       </w:pPr>
       <w:r>
         <w:t xml:space="preserve">12.</w:t>
@@ -790,7 +579,7 @@
     </w:p>
     <w:p>
       <w:pPr>
-        <w:pStyle w:val="Allegation"/>
+        <w:pStyle w:val="NumberedParagraph"/>
       </w:pPr>
       <w:r>
         <w:t xml:space="preserve">13.</w:t>
@@ -799,12 +588,12 @@
         <w:tab/>
       </w:r>
       <w:r>
-        <w:t xml:space="preserve">In June 2021, Crescent began using a bank account at Hancock Whitney Bank, account ending in 6707 (“Martin/Crescent Account”), for the financial operations related to services provided on Martin’s behalf under the MSA. The account was in the name of “Crescent Drilling and Production, Inc. Client Services”. Upon information and belief, only the Debtor’s money was held in the Martin/Crescent Account. Neither CDP nor CDF contributed funds to the Martin/Crescent Account. CDP, an agent of Martin, had complete control of the funds in the Martin/Crescent Account and was able to decide which vendors were paid.</w:t>
-      </w:r>
-    </w:p>
-    <w:p>
-      <w:pPr>
-        <w:pStyle w:val="Allegation"/>
+        <w:t xml:space="preserve">In June 2021, Crescent began using a bank account at Hancock Whitney Bank, account ending in 6707 (“Martin/​Crescent Account”), for the financial operations related to services provided on Martin’s behalf under the MSA. The account was in the name of “Crescent Drilling and Production, Inc. Client Services”. Upon information and belief, only the Debtor’s money was held in the Martin/​Crescent Account. Neither CDP nor CDF contributed funds to the Martin/​Crescent Account. CDP, an agent of Martin, had complete control of the funds in the Martin/​Crescent Account and was able to decide which vendors were paid.</w:t>
+      </w:r>
+    </w:p>
+    <w:p>
+      <w:pPr>
+        <w:pStyle w:val="NumberedParagraph"/>
       </w:pPr>
       <w:r>
         <w:t xml:space="preserve">14.</w:t>
@@ -813,12 +602,12 @@
         <w:tab/>
       </w:r>
       <w:r>
-        <w:t xml:space="preserve">Working interest owners paid invoices for cash calls and joint interest billings directly to the Martin/Crescent Account, and funds generated from the sale of oil and gas were also deposited into the Martin/Crescent Account. Invoices from vendors and subcontractors were paid by Crescent from the Martin/Crescent Account. Martin did not have control over the Martin/Crescent Account and did not have the authority to dictate which invoices were paid. Essentially, CDP had functional economic control of the Debtor.</w:t>
-      </w:r>
-    </w:p>
-    <w:p>
-      <w:pPr>
-        <w:pStyle w:val="Allegation"/>
+        <w:t xml:space="preserve">Working interest owners paid invoices for cash calls and joint interest billings directly to the Martin/​Crescent Account, and funds generated from the sale of oil and gas were also deposited into the Martin/​Crescent Account. Invoices from vendors and subcontractors were paid by Crescent from the Martin/​Crescent Account. Martin did not have control over the Martin/​Crescent Account and did not have the authority to dictate which invoices were paid. Essentially, CDP had functional economic control of the Debtor.</w:t>
+      </w:r>
+    </w:p>
+    <w:p>
+      <w:pPr>
+        <w:pStyle w:val="NumberedParagraph"/>
       </w:pPr>
       <w:r>
         <w:t xml:space="preserve">15.</w:t>
@@ -834,15 +623,13 @@
       <w:pPr>
         <w:pStyle w:val="Heading2"/>
       </w:pPr>
-      <w:bookmarkStart w:id="14" w:name="_0c60ca997dfd30107a4a029978822b851a59c6d"/>
       <w:r>
         <w:t xml:space="preserve">The A0392 Well</w:t>
       </w:r>
-      <w:bookmarkEnd w:id="14"/>
-    </w:p>
-    <w:p>
-      <w:pPr>
-        <w:pStyle w:val="Allegation"/>
+    </w:p>
+    <w:p>
+      <w:pPr>
+        <w:pStyle w:val="NumberedParagraph"/>
       </w:pPr>
       <w:r>
         <w:t xml:space="preserve">16.</w:t>
@@ -851,12 +638,12 @@
         <w:tab/>
       </w:r>
       <w:r>
-        <w:t xml:space="preserve">Included in the services provided to Martin by Crescent was drilling the A0392 well. Based on the drilling of prior wells in the Empire Field, good engineering and/or oil field practices required the well to be gravel packed during drilling. Nonetheless, and even though the engineering proposal contained gravel packing as a procedure, Crescent chose to deviate from the engineering plan and not gravel pack the A0392 Well.</w:t>
-      </w:r>
-    </w:p>
-    <w:p>
-      <w:pPr>
-        <w:pStyle w:val="Allegation"/>
+        <w:t xml:space="preserve">Included in the services provided to Martin by Crescent was drilling the A0392 well. Based on the drilling of prior wells in the Empire Field, good engineering and/​or oil field practices required the well to be gravel packed during drilling. Nonetheless, and even though the engineering proposal contained gravel packing as a procedure, Crescent chose to deviate from the engineering plan and not gravel pack the A0392 Well.</w:t>
+      </w:r>
+    </w:p>
+    <w:p>
+      <w:pPr>
+        <w:pStyle w:val="NumberedParagraph"/>
       </w:pPr>
       <w:r>
         <w:t xml:space="preserve">17.</w:t>
@@ -865,32 +652,34 @@
         <w:tab/>
       </w:r>
       <w:r>
-        <w:t xml:space="preserve">In January/February, 2022, Crescent caused the A0392 Well to “sand in” when it opened the choke or “yanked” and “pulled” on the choke on the well to increase production. The opening of the choke increased production to approximately 600 barrels a day. After a few days, the well became clogged. The loss of the well resulted from a failure to gravel pack the well, combined with opening the choke to a size too large. Without gravel packing, the A0392 Well was producing and should only have continued to produce an estimated 200-250 barrels a day to avoid the well sanding in. As a result of the sanding, the Debtor was required to recomplete the A0392 Well in the K4 Sand in September 2022. CDP’s acts resulted in Martin incurring additional costs to recomplete the well, plus loss of profits due to greatly reduced production.</w:t>
+        <w:t xml:space="preserve">In January/​February, 2022, Crescent caused the A0392 Well to “sand in” when it opened the choke or “yanked” and “pulled” on the choke on the well to increase production. The opening of the choke increased production to approximately 600 barrels a day. After a few days, the well became clogged. The loss of the well resulted from a failure to gravel pack the well, combined with opening the choke to a size too large. Without gravel packing, the A0392 Well was producing and should only have continued to produce an estimated 200</w:t>
+      </w:r>
+      <w:r>
+        <w:noBreakHyphen/>
+      </w:r>
+      <w:r>
+        <w:t xml:space="preserve">250 barrels a day to avoid the well sanding in. As a result of the sanding, the Debtor was required to recomplete the A0392 Well in the K4 Sand in September 2022. CDP’s acts resulted in Martin incurring additional costs to recomplete the well, plus loss of profits due to greatly reduced production.</w:t>
       </w:r>
     </w:p>
     <w:p>
       <w:pPr>
         <w:pStyle w:val="Heading1"/>
       </w:pPr>
-      <w:bookmarkStart w:id="15" w:name="_41581de74248d8366748d9df537c456688ab127"/>
       <w:r>
         <w:t xml:space="preserve">COUNT I</w:t>
       </w:r>
-      <w:bookmarkEnd w:id="15"/>
     </w:p>
     <w:p>
       <w:pPr>
         <w:pStyle w:val="Heading2"/>
       </w:pPr>
-      <w:bookmarkStart w:id="16" w:name="_9df7cc31eef2104e4f3c3c872b151cab53137fb"/>
       <w:r>
         <w:t xml:space="preserve">BREACH OF CONTRACT</w:t>
       </w:r>
-      <w:bookmarkEnd w:id="16"/>
-    </w:p>
-    <w:p>
-      <w:pPr>
-        <w:pStyle w:val="Allegation"/>
+    </w:p>
+    <w:p>
+      <w:pPr>
+        <w:pStyle w:val="NumberedParagraph"/>
       </w:pPr>
       <w:r>
         <w:t xml:space="preserve">18.</w:t>
@@ -904,7 +693,7 @@
     </w:p>
     <w:p>
       <w:pPr>
-        <w:pStyle w:val="Allegation"/>
+        <w:pStyle w:val="NumberedParagraph"/>
       </w:pPr>
       <w:r>
         <w:t xml:space="preserve">19.</w:t>
@@ -918,7 +707,7 @@
     </w:p>
     <w:p>
       <w:pPr>
-        <w:pStyle w:val="Allegation"/>
+        <w:pStyle w:val="NumberedParagraph"/>
       </w:pPr>
       <w:r>
         <w:t xml:space="preserve">20.</w:t>
@@ -941,7 +730,7 @@
         <w:tab/>
       </w:r>
       <w:r>
-        <w:t xml:space="preserve">CDP warranted the performance of all Services in a good and workmanlike manner in accordance with good engineering and/or oil field practices.</w:t>
+        <w:t xml:space="preserve">CDP warranted the performance of all Services in a good and workmanlike manner in accordance with good engineering and/​or oil field practices.</w:t>
       </w:r>
     </w:p>
     <w:p>
@@ -974,7 +763,7 @@
     </w:p>
     <w:p>
       <w:pPr>
-        <w:pStyle w:val="Allegation"/>
+        <w:pStyle w:val="NumberedParagraph"/>
       </w:pPr>
       <w:r>
         <w:t xml:space="preserve">21.</w:t>
@@ -1030,7 +819,7 @@
     </w:p>
     <w:p>
       <w:pPr>
-        <w:pStyle w:val="Allegation"/>
+        <w:pStyle w:val="NumberedParagraph"/>
       </w:pPr>
       <w:r>
         <w:t xml:space="preserve">22.</w:t>
@@ -1039,12 +828,12 @@
         <w:tab/>
       </w:r>
       <w:r>
-        <w:t xml:space="preserve">Martin did not have control over the manner and method of performance by Crescent or the Martin/Crescent Account.</w:t>
-      </w:r>
-    </w:p>
-    <w:p>
-      <w:pPr>
-        <w:pStyle w:val="Allegation"/>
+        <w:t xml:space="preserve">Martin did not have control over the manner and method of performance by Crescent or the Martin/​Crescent Account.</w:t>
+      </w:r>
+    </w:p>
+    <w:p>
+      <w:pPr>
+        <w:pStyle w:val="NumberedParagraph"/>
       </w:pPr>
       <w:r>
         <w:t xml:space="preserve">23.</w:t>
@@ -1053,12 +842,12 @@
         <w:tab/>
       </w:r>
       <w:r>
-        <w:t xml:space="preserve">CDP’s decisions to ignore the engineering proposal by not gravel packing the A0392 Well during drilling and opening the choke at the A0392 Well to allow production of approximately 600 barrels per day breached its obligations to follow good engineering and/or oil field practices.</w:t>
-      </w:r>
-    </w:p>
-    <w:p>
-      <w:pPr>
-        <w:pStyle w:val="Allegation"/>
+        <w:t xml:space="preserve">CDP’s decisions to ignore the engineering proposal by not gravel packing the A0392 Well during drilling and opening the choke at the A0392 Well to allow production of approximately 600 barrels per day breached its obligations to follow good engineering and/​or oil field practices.</w:t>
+      </w:r>
+    </w:p>
+    <w:p>
+      <w:pPr>
+        <w:pStyle w:val="NumberedParagraph"/>
       </w:pPr>
       <w:r>
         <w:t xml:space="preserve">24.</w:t>
@@ -1072,7 +861,7 @@
     </w:p>
     <w:p>
       <w:pPr>
-        <w:pStyle w:val="Allegation"/>
+        <w:pStyle w:val="NumberedParagraph"/>
       </w:pPr>
       <w:r>
         <w:t xml:space="preserve">25.</w:t>
@@ -1088,25 +877,21 @@
       <w:pPr>
         <w:pStyle w:val="Heading1"/>
       </w:pPr>
-      <w:bookmarkStart w:id="17" w:name="_111e050be4162d411761924b126e897a1cf108c"/>
       <w:r>
         <w:t xml:space="preserve">COUNT II</w:t>
       </w:r>
-      <w:bookmarkEnd w:id="17"/>
     </w:p>
     <w:p>
       <w:pPr>
         <w:pStyle w:val="Heading2"/>
       </w:pPr>
-      <w:bookmarkStart w:id="18" w:name="_negligence"/>
       <w:r>
         <w:t xml:space="preserve">NEGLIGENCE</w:t>
       </w:r>
-      <w:bookmarkEnd w:id="18"/>
-    </w:p>
-    <w:p>
-      <w:pPr>
-        <w:pStyle w:val="Allegation"/>
+    </w:p>
+    <w:p>
+      <w:pPr>
+        <w:pStyle w:val="NumberedParagraph"/>
       </w:pPr>
       <w:r>
         <w:t xml:space="preserve">26.</w:t>
@@ -1120,7 +905,7 @@
     </w:p>
     <w:p>
       <w:pPr>
-        <w:pStyle w:val="Allegation"/>
+        <w:pStyle w:val="NumberedParagraph"/>
       </w:pPr>
       <w:r>
         <w:t xml:space="preserve">27.</w:t>
@@ -1136,15 +921,13 @@
       <w:pPr>
         <w:pStyle w:val="Heading3"/>
       </w:pPr>
-      <w:bookmarkStart w:id="19" w:name="_8920c00def4266cdc85851a952a87c3452f4616"/>
       <w:r>
         <w:t xml:space="preserve">Allegations Regarding the A0392 Well</w:t>
       </w:r>
-      <w:bookmarkEnd w:id="19"/>
-    </w:p>
-    <w:p>
-      <w:pPr>
-        <w:pStyle w:val="Allegation"/>
+    </w:p>
+    <w:p>
+      <w:pPr>
+        <w:pStyle w:val="NumberedParagraph"/>
       </w:pPr>
       <w:r>
         <w:t xml:space="preserve">28.</w:t>
@@ -1158,7 +941,7 @@
     </w:p>
     <w:p>
       <w:pPr>
-        <w:pStyle w:val="Allegation"/>
+        <w:pStyle w:val="NumberedParagraph"/>
       </w:pPr>
       <w:r>
         <w:t xml:space="preserve">29.</w:t>
@@ -1172,7 +955,7 @@
     </w:p>
     <w:p>
       <w:pPr>
-        <w:pStyle w:val="Allegation"/>
+        <w:pStyle w:val="NumberedParagraph"/>
       </w:pPr>
       <w:r>
         <w:t xml:space="preserve">30.</w:t>
@@ -1181,12 +964,18 @@
         <w:tab/>
       </w:r>
       <w:r>
-        <w:t xml:space="preserve">CDF also breached its duty relative to the A0392 Well when it opened the choke or “yanked” and “pulled” on the choke on the well to the point that the well was producing approximately 600 barrels a day, against expert engineering advice that it should only be producing at 200-250 barrels a day.</w:t>
-      </w:r>
-    </w:p>
-    <w:p>
-      <w:pPr>
-        <w:pStyle w:val="Allegation"/>
+        <w:t xml:space="preserve">CDF also breached its duty relative to the A0392 Well when it opened the choke or “yanked” and “pulled” on the choke on the well to the point that the well was producing approximately 600 barrels a day, against expert engineering advice that it should only be producing at 200</w:t>
+      </w:r>
+      <w:r>
+        <w:noBreakHyphen/>
+      </w:r>
+      <w:r>
+        <w:t xml:space="preserve">250 barrels a day.</w:t>
+      </w:r>
+    </w:p>
+    <w:p>
+      <w:pPr>
+        <w:pStyle w:val="NumberedParagraph"/>
       </w:pPr>
       <w:r>
         <w:t xml:space="preserve">31.</w:t>
@@ -1200,7 +989,7 @@
     </w:p>
     <w:p>
       <w:pPr>
-        <w:pStyle w:val="Allegation"/>
+        <w:pStyle w:val="NumberedParagraph"/>
       </w:pPr>
       <w:r>
         <w:t xml:space="preserve">32.</w:t>
@@ -1214,7 +1003,7 @@
     </w:p>
     <w:p>
       <w:pPr>
-        <w:pStyle w:val="Allegation"/>
+        <w:pStyle w:val="NumberedParagraph"/>
       </w:pPr>
       <w:r>
         <w:t xml:space="preserve">33.</w:t>
@@ -1230,15 +1019,13 @@
       <w:pPr>
         <w:pStyle w:val="Heading3"/>
       </w:pPr>
-      <w:bookmarkStart w:id="20" w:name="_2f196d5438df5b8c0956207072dcd2b2921c120"/>
       <w:r>
         <w:t xml:space="preserve">Allegations Regarding the H&amp;D Well</w:t>
       </w:r>
-      <w:bookmarkEnd w:id="20"/>
-    </w:p>
-    <w:p>
-      <w:pPr>
-        <w:pStyle w:val="Allegation"/>
+    </w:p>
+    <w:p>
+      <w:pPr>
+        <w:pStyle w:val="NumberedParagraph"/>
       </w:pPr>
       <w:r>
         <w:t xml:space="preserve">34.</w:t>
@@ -1252,7 +1039,7 @@
     </w:p>
     <w:p>
       <w:pPr>
-        <w:pStyle w:val="Allegation"/>
+        <w:pStyle w:val="NumberedParagraph"/>
       </w:pPr>
       <w:r>
         <w:t xml:space="preserve">35.</w:t>
@@ -1268,25 +1055,21 @@
       <w:pPr>
         <w:pStyle w:val="Heading1"/>
       </w:pPr>
-      <w:bookmarkStart w:id="21" w:name="_1ea1e36b018035974e6e6cbf4986663d88c992e"/>
       <w:r>
         <w:t xml:space="preserve">COUNT X</w:t>
       </w:r>
-      <w:bookmarkEnd w:id="21"/>
     </w:p>
     <w:p>
       <w:pPr>
         <w:pStyle w:val="Heading2"/>
       </w:pPr>
-      <w:bookmarkStart w:id="22" w:name="_b32be5b7526b253dacbfcff058ed39a15b8127a"/>
       <w:r>
         <w:t xml:space="preserve">OBJECTION(S) TO CDF CLAIM</w:t>
       </w:r>
-      <w:bookmarkEnd w:id="22"/>
-    </w:p>
-    <w:p>
-      <w:pPr>
-        <w:pStyle w:val="Allegation"/>
+    </w:p>
+    <w:p>
+      <w:pPr>
+        <w:pStyle w:val="NumberedParagraph"/>
       </w:pPr>
       <w:r>
         <w:t xml:space="preserve">36.</w:t>
@@ -1300,7 +1083,7 @@
     </w:p>
     <w:p>
       <w:pPr>
-        <w:pStyle w:val="Allegation"/>
+        <w:pStyle w:val="NumberedParagraph"/>
       </w:pPr>
       <w:r>
         <w:t xml:space="preserve">37.</w:t>
@@ -1314,7 +1097,7 @@
     </w:p>
     <w:p>
       <w:pPr>
-        <w:pStyle w:val="Allegation"/>
+        <w:pStyle w:val="NumberedParagraph"/>
       </w:pPr>
       <w:r>
         <w:t xml:space="preserve">38.</w:t>
@@ -1328,7 +1111,7 @@
     </w:p>
     <w:p>
       <w:pPr>
-        <w:pStyle w:val="Allegation"/>
+        <w:pStyle w:val="NumberedParagraph"/>
       </w:pPr>
       <w:r>
         <w:t xml:space="preserve">39.</w:t>
@@ -1344,15 +1127,13 @@
       <w:pPr>
         <w:pStyle w:val="Heading1"/>
       </w:pPr>
-      <w:bookmarkStart w:id="23" w:name="_ef66b8fb8023651585f5d55fe5a420ee6f5e8cc"/>
       <w:r>
         <w:t xml:space="preserve">PRAYER FOR RELIEF</w:t>
       </w:r>
-      <w:bookmarkEnd w:id="23"/>
-    </w:p>
-    <w:p>
-      <w:pPr>
-        <w:pStyle w:val="Allegation"/>
+    </w:p>
+    <w:p>
+      <w:pPr>
+        <w:pStyle w:val="NumberedParagraph"/>
       </w:pPr>
       <w:r>
         <w:t xml:space="preserve">40.</w:t>
@@ -1403,7 +1184,7 @@
         <w:tab/>
       </w:r>
       <w:r>
-        <w:t xml:space="preserve">For a judgment to equitably subordinate the CDP Claim by transferring any lien securing the CDP Claim to the Estate, or alternatively, subordinate the CDP Claim to all unsecured creditors pursuant to 11 U.S.C. § 510(c).</w:t>
+        <w:t xml:space="preserve">For a judgment to equitably subordinate the CDP Claim by transferring any lien securing the CDP Claim to the Estate, or alternatively, subordinate the CDP Claim to all unsecured creditors pursuant to 11 U.S.C. § 510(c).</w:t>
       </w:r>
     </w:p>
     <w:p>
@@ -1417,7 +1198,7 @@
         <w:tab/>
       </w:r>
       <w:r>
-        <w:t xml:space="preserve">For a judgment avoiding the CDP Transfers pursuant to 11 U.S.C. § 548(a)(1)(B).</w:t>
+        <w:t xml:space="preserve">For a judgment avoiding the CDP Transfers pursuant to 11 U.S.C. § 548(a)⁠(1)⁠(B).</w:t>
       </w:r>
     </w:p>
     <w:p>
@@ -1431,7 +1212,7 @@
         <w:tab/>
       </w:r>
       <w:r>
-        <w:t xml:space="preserve">For a judgment avoiding the CDF Transfers pursuant to 11 U.S.C. § 548(a)(1)(B).</w:t>
+        <w:t xml:space="preserve">For a judgment avoiding the CDF Transfers pursuant to 11 U.S.C. § 548(a)⁠(1)⁠(B).</w:t>
       </w:r>
     </w:p>
     <w:p>
@@ -1445,7 +1226,13 @@
         <w:tab/>
       </w:r>
       <w:r>
-        <w:t xml:space="preserve">For a judgment avoiding the CDP Transfers pursuant to 11 U.S.C. § 544 and LA C.C. Art. 2036-2043.</w:t>
+        <w:t xml:space="preserve">For a judgment avoiding the CDP Transfers pursuant to 11 U.S.C. § 544 and LA C.C. Art. 2036</w:t>
+      </w:r>
+      <w:r>
+        <w:noBreakHyphen/>
+      </w:r>
+      <w:r>
+        <w:t xml:space="preserve">2043.</w:t>
       </w:r>
     </w:p>
     <w:p>
@@ -1459,7 +1246,13 @@
         <w:tab/>
       </w:r>
       <w:r>
-        <w:t xml:space="preserve">For a judgment avoiding the CDF Transfers pursuant to 11 U.S.C. § 544 and LA C.C. Art. 2036-2043.</w:t>
+        <w:t xml:space="preserve">For a judgment avoiding the CDF Transfers pursuant to 11 U.S.C. § 544 and LA C.C. Art. 2036</w:t>
+      </w:r>
+      <w:r>
+        <w:noBreakHyphen/>
+      </w:r>
+      <w:r>
+        <w:t xml:space="preserve">2043.</w:t>
       </w:r>
     </w:p>
     <w:p>
@@ -1473,7 +1266,7 @@
         <w:tab/>
       </w:r>
       <w:r>
-        <w:t xml:space="preserve">For a judgment to recover the value of the avoided transfers pursuant to 11 U.S.C. § 550.</w:t>
+        <w:t xml:space="preserve">For a judgment to recover the value of the avoided transfers pursuant to 11 U.S.C. § 550.</w:t>
       </w:r>
     </w:p>
     <w:p>
@@ -1520,9 +1313,16 @@
     </w:p>
     <w:p>
       <w:pPr>
-        <w:pStyle w:val="Signature"/>
+        <w:spacing w:before="0" w:after="0" w:line="480" w:lineRule="exact"/>
+      </w:pPr>
+    </w:p>
+    <w:p>
+      <w:pPr>
         <w:keepNext/>
-        <w:spacing w:before="200"/>
+        <w:keepLines/>
+        <w:spacing w:before="0" w:after="0" w:line="276" w:lineRule="exact"/>
+        <w:ind w:left="4320" w:firstLine="0"/>
+        <w:jc w:val="left"/>
       </w:pPr>
       <w:r>
         <w:t xml:space="preserve">Respectfully submitted,</w:t>
@@ -1530,15 +1330,17 @@
     </w:p>
     <w:p>
       <w:pPr>
-        <w:pStyle w:val="Signature"/>
         <w:keepNext/>
-        <w:spacing w:before="200"/>
+        <w:keepLines/>
+        <w:spacing w:before="480" w:after="0" w:line="276" w:lineRule="exact"/>
+        <w:ind w:left="4320" w:firstLine="0"/>
+        <w:jc w:val="left"/>
       </w:pPr>
       <w:r>
         <w:t xml:space="preserve">BY: </w:t>
       </w:r>
       <w:r>
-        <w:t xml:space="preserve">/s/</w:t>
+        <w:t xml:space="preserve">/​s/</w:t>
       </w:r>
       <w:r>
         <w:t xml:space="preserve"> </w:t>
@@ -1561,9 +1363,11 @@
     </w:p>
     <w:p>
       <w:pPr>
-        <w:pStyle w:val="Signature"/>
         <w:keepNext/>
-        <w:spacing w:before="40"/>
+        <w:keepLines/>
+        <w:spacing w:before="240" w:after="0" w:line="276" w:lineRule="exact"/>
+        <w:ind w:left="4320" w:firstLine="0"/>
+        <w:jc w:val="left"/>
       </w:pPr>
       <w:r>
         <w:t xml:space="preserve">ALBERT</w:t>
@@ -1595,8 +1399,11 @@
     </w:p>
     <w:p>
       <w:pPr>
-        <w:pStyle w:val="Signature"/>
         <w:keepNext/>
+        <w:keepLines/>
+        <w:spacing w:before="0" w:after="0" w:line="276" w:lineRule="exact"/>
+        <w:ind w:left="4320" w:firstLine="0"/>
+        <w:jc w:val="left"/>
       </w:pPr>
       <w:r>
         <w:t xml:space="preserve">PATRICK</w:t>
@@ -1622,8 +1429,11 @@
     </w:p>
     <w:p>
       <w:pPr>
-        <w:pStyle w:val="Signature"/>
         <w:keepNext/>
+        <w:keepLines/>
+        <w:spacing w:before="0" w:after="0" w:line="276" w:lineRule="exact"/>
+        <w:ind w:left="4320" w:firstLine="0"/>
+        <w:jc w:val="left"/>
       </w:pPr>
       <w:r>
         <w:t xml:space="preserve">THE</w:t>
@@ -1655,8 +1465,11 @@
     </w:p>
     <w:p>
       <w:pPr>
-        <w:pStyle w:val="Signature"/>
         <w:keepNext/>
+        <w:keepLines/>
+        <w:spacing w:before="0" w:after="0" w:line="276" w:lineRule="exact"/>
+        <w:ind w:left="4320" w:firstLine="0"/>
+        <w:jc w:val="left"/>
       </w:pPr>
       <w:r>
         <w:t xml:space="preserve">3027</w:t>
@@ -1676,8 +1489,11 @@
     </w:p>
     <w:p>
       <w:pPr>
-        <w:pStyle w:val="Signature"/>
         <w:keepNext/>
+        <w:keepLines/>
+        <w:spacing w:before="0" w:after="0" w:line="276" w:lineRule="exact"/>
+        <w:ind w:left="4320" w:firstLine="0"/>
+        <w:jc w:val="left"/>
       </w:pPr>
       <w:r>
         <w:t xml:space="preserve">Metairie,</w:t>
@@ -1697,8 +1513,11 @@
     </w:p>
     <w:p>
       <w:pPr>
-        <w:pStyle w:val="Signature"/>
         <w:keepNext/>
+        <w:keepLines/>
+        <w:spacing w:before="0" w:after="0" w:line="276" w:lineRule="exact"/>
+        <w:ind w:left="4320" w:firstLine="0"/>
+        <w:jc w:val="left"/>
       </w:pPr>
       <w:r>
         <w:t xml:space="preserve">Telephone:</w:t>
@@ -1712,8 +1531,11 @@
     </w:p>
     <w:p>
       <w:pPr>
-        <w:pStyle w:val="Signature"/>
         <w:keepNext/>
+        <w:keepLines/>
+        <w:spacing w:before="0" w:after="0" w:line="276" w:lineRule="exact"/>
+        <w:ind w:left="4320" w:firstLine="0"/>
+        <w:jc w:val="left"/>
       </w:pPr>
       <w:r>
         <w:t xml:space="preserve">Facsimile:</w:t>
@@ -1727,8 +1549,11 @@
     </w:p>
     <w:p>
       <w:pPr>
-        <w:pStyle w:val="Signature"/>
         <w:keepNext/>
+        <w:keepLines/>
+        <w:spacing w:before="0" w:after="0" w:line="276" w:lineRule="exact"/>
+        <w:ind w:left="4320" w:firstLine="0"/>
+        <w:jc w:val="left"/>
       </w:pPr>
       <w:r>
         <w:t xml:space="preserve">E-mail:</w:t>
@@ -1742,8 +1567,11 @@
     </w:p>
     <w:p>
       <w:pPr>
-        <w:pStyle w:val="Signature"/>
         <w:keepNext/>
+        <w:keepLines/>
+        <w:spacing w:before="0" w:after="0" w:line="276" w:lineRule="exact"/>
+        <w:ind w:left="4320" w:firstLine="0"/>
+        <w:jc w:val="left"/>
       </w:pPr>
       <w:r>
         <w:t xml:space="preserve">E-mail:</w:t>
@@ -1757,9 +1585,11 @@
     </w:p>
     <w:p>
       <w:pPr>
-        <w:pStyle w:val="Signature"/>
         <w:keepNext/>
-        <w:spacing w:before="40"/>
+        <w:keepLines/>
+        <w:spacing w:before="240" w:after="0" w:line="276" w:lineRule="exact"/>
+        <w:ind w:left="4320" w:firstLine="0"/>
+        <w:jc w:val="left"/>
       </w:pPr>
       <w:r>
         <w:t xml:space="preserve">And</w:t>
@@ -1767,9 +1597,11 @@
     </w:p>
     <w:p>
       <w:pPr>
-        <w:pStyle w:val="Signature"/>
         <w:keepNext/>
-        <w:spacing w:before="40"/>
+        <w:keepLines/>
+        <w:spacing w:before="240" w:after="0" w:line="276" w:lineRule="exact"/>
+        <w:ind w:left="4320" w:firstLine="0"/>
+        <w:jc w:val="left"/>
       </w:pPr>
       <w:r>
         <w:t xml:space="preserve">CHARLES</w:t>
@@ -1789,8 +1621,11 @@
     </w:p>
     <w:p>
       <w:pPr>
-        <w:pStyle w:val="Signature"/>
         <w:keepNext/>
+        <w:keepLines/>
+        <w:spacing w:before="0" w:after="0" w:line="276" w:lineRule="exact"/>
+        <w:ind w:left="4320" w:firstLine="0"/>
+        <w:jc w:val="left"/>
       </w:pPr>
       <w:r>
         <w:t xml:space="preserve">FONDREN</w:t>
@@ -1816,8 +1651,11 @@
     </w:p>
     <w:p>
       <w:pPr>
-        <w:pStyle w:val="Signature"/>
         <w:keepNext/>
+        <w:keepLines/>
+        <w:spacing w:before="0" w:after="0" w:line="276" w:lineRule="exact"/>
+        <w:ind w:left="4320" w:firstLine="0"/>
+        <w:jc w:val="left"/>
       </w:pPr>
       <w:r>
         <w:t xml:space="preserve">10101</w:t>
@@ -1849,8 +1687,11 @@
     </w:p>
     <w:p>
       <w:pPr>
-        <w:pStyle w:val="Signature"/>
         <w:keepNext/>
+        <w:keepLines/>
+        <w:spacing w:before="0" w:after="0" w:line="276" w:lineRule="exact"/>
+        <w:ind w:left="4320" w:firstLine="0"/>
+        <w:jc w:val="left"/>
       </w:pPr>
       <w:r>
         <w:t xml:space="preserve">Baton</w:t>
@@ -1876,8 +1717,11 @@
     </w:p>
     <w:p>
       <w:pPr>
-        <w:pStyle w:val="Signature"/>
         <w:keepNext/>
+        <w:keepLines/>
+        <w:spacing w:before="0" w:after="0" w:line="276" w:lineRule="exact"/>
+        <w:ind w:left="4320" w:firstLine="0"/>
+        <w:jc w:val="left"/>
       </w:pPr>
       <w:r>
         <w:t xml:space="preserve">Telephone:</w:t>
@@ -1891,8 +1735,11 @@
     </w:p>
     <w:p>
       <w:pPr>
-        <w:pStyle w:val="Signature"/>
         <w:keepNext/>
+        <w:keepLines/>
+        <w:spacing w:before="0" w:after="0" w:line="276" w:lineRule="exact"/>
+        <w:ind w:left="4320" w:firstLine="0"/>
+        <w:jc w:val="left"/>
       </w:pPr>
       <w:r>
         <w:t xml:space="preserve">Facsimile:</w:t>
@@ -1906,8 +1753,11 @@
     </w:p>
     <w:p>
       <w:pPr>
-        <w:pStyle w:val="Signature"/>
         <w:keepNext/>
+        <w:keepLines/>
+        <w:spacing w:before="0" w:after="0" w:line="276" w:lineRule="exact"/>
+        <w:ind w:left="4320" w:firstLine="0"/>
+        <w:jc w:val="left"/>
       </w:pPr>
       <w:r>
         <w:t xml:space="preserve">Email:</w:t>
@@ -1921,95 +1771,112 @@
     </w:p>
     <w:p>
       <w:pPr>
-        <w:pStyle w:val="Signature"/>
+        <w:spacing w:before="0" w:after="0" w:line="276" w:lineRule="exact"/>
+        <w:ind w:left="4320" w:firstLine="0"/>
+        <w:jc w:val="left"/>
       </w:pPr>
       <w:r>
         <w:rPr>
           <w:i/>
+          <w:iCs/>
         </w:rPr>
         <w:t xml:space="preserve">Counsel</w:t>
       </w:r>
       <w:r>
         <w:rPr>
           <w:i/>
+          <w:iCs/>
         </w:rPr>
         <w:t xml:space="preserve"> </w:t>
       </w:r>
       <w:r>
         <w:rPr>
           <w:i/>
+          <w:iCs/>
         </w:rPr>
         <w:t xml:space="preserve">for</w:t>
       </w:r>
       <w:r>
         <w:rPr>
           <w:i/>
+          <w:iCs/>
         </w:rPr>
         <w:t xml:space="preserve"> </w:t>
       </w:r>
       <w:r>
         <w:rPr>
           <w:i/>
+          <w:iCs/>
         </w:rPr>
         <w:t xml:space="preserve">Wilbur</w:t>
       </w:r>
       <w:r>
         <w:rPr>
           <w:i/>
+          <w:iCs/>
         </w:rPr>
         <w:t xml:space="preserve"> </w:t>
       </w:r>
       <w:r>
         <w:rPr>
           <w:i/>
+          <w:iCs/>
         </w:rPr>
         <w:t xml:space="preserve">J.</w:t>
       </w:r>
       <w:r>
         <w:rPr>
           <w:i/>
+          <w:iCs/>
         </w:rPr>
         <w:t xml:space="preserve"> </w:t>
       </w:r>
       <w:r>
         <w:rPr>
           <w:i/>
+          <w:iCs/>
         </w:rPr>
         <w:t xml:space="preserve">“Bill”</w:t>
       </w:r>
       <w:r>
         <w:rPr>
           <w:i/>
+          <w:iCs/>
         </w:rPr>
         <w:t xml:space="preserve"> </w:t>
       </w:r>
       <w:r>
         <w:rPr>
           <w:i/>
+          <w:iCs/>
         </w:rPr>
         <w:t xml:space="preserve">Babin,</w:t>
       </w:r>
       <w:r>
         <w:rPr>
           <w:i/>
+          <w:iCs/>
         </w:rPr>
         <w:t xml:space="preserve"> </w:t>
       </w:r>
       <w:r>
         <w:rPr>
           <w:i/>
+          <w:iCs/>
         </w:rPr>
         <w:t xml:space="preserve">Jr.,</w:t>
       </w:r>
       <w:r>
         <w:rPr>
           <w:i/>
+          <w:iCs/>
         </w:rPr>
         <w:t xml:space="preserve"> </w:t>
       </w:r>
       <w:r>
         <w:rPr>
           <w:i/>
+          <w:iCs/>
         </w:rPr>
         <w:t xml:space="preserve">Trustee</w:t>
       </w:r>
@@ -2017,7 +1884,7 @@
     <w:sectPr>
       <w:footerReference w:type="default" r:id="rIdFooter1"/>
       <w:pgSz w:w="12240" w:h="15840"/>
-      <w:pgMar w:top="1440" w:right="1440" w:bottom="1440" w:left="1440" w:header="720" w:footer="720" w:gutter="0"/>
+      <w:pgMar w:top="1440" w:right="1440" w:bottom="1440" w:left="1440" w:header="720" w:footer="731" w:gutter="0"/>
     </w:sectPr>
   </w:body>
 </w:document>
@@ -2031,42 +1898,91 @@
 <w:ftr xmlns:w="http://schemas.openxmlformats.org/wordprocessingml/2006/main" xmlns:r="http://schemas.openxmlformats.org/officeDocument/2006/relationships">
   <w:p>
     <w:pPr>
-      <w:pStyle w:val="Footer"/>
+      <w:spacing w:before="0" w:after="0" w:line="276" w:lineRule="exact"/>
+      <w:jc w:val="center"/>
     </w:pPr>
     <w:r>
+      <w:rPr>
+        <w:sz w:val="22"/>
+        <w:szCs w:val="22"/>
+      </w:rPr>
       <w:t xml:space="preserve">Page </w:t>
     </w:r>
     <w:r>
+      <w:rPr>
+        <w:sz w:val="22"/>
+        <w:szCs w:val="22"/>
+      </w:rPr>
       <w:fldChar w:fldCharType="begin"/>
     </w:r>
     <w:r>
+      <w:rPr>
+        <w:sz w:val="22"/>
+        <w:szCs w:val="22"/>
+      </w:rPr>
       <w:instrText xml:space="preserve"> PAGE </w:instrText>
     </w:r>
     <w:r>
+      <w:rPr>
+        <w:sz w:val="22"/>
+        <w:szCs w:val="22"/>
+      </w:rPr>
       <w:fldChar w:fldCharType="separate"/>
     </w:r>
     <w:r>
+      <w:rPr>
+        <w:sz w:val="22"/>
+        <w:szCs w:val="22"/>
+      </w:rPr>
       <w:t>1</w:t>
     </w:r>
     <w:r>
+      <w:rPr>
+        <w:sz w:val="22"/>
+        <w:szCs w:val="22"/>
+      </w:rPr>
       <w:fldChar w:fldCharType="end"/>
     </w:r>
     <w:r>
+      <w:rPr>
+        <w:sz w:val="22"/>
+        <w:szCs w:val="22"/>
+      </w:rPr>
       <w:t xml:space="preserve"> of </w:t>
     </w:r>
     <w:r>
+      <w:rPr>
+        <w:sz w:val="22"/>
+        <w:szCs w:val="22"/>
+      </w:rPr>
       <w:fldChar w:fldCharType="begin"/>
     </w:r>
     <w:r>
+      <w:rPr>
+        <w:sz w:val="22"/>
+        <w:szCs w:val="22"/>
+      </w:rPr>
       <w:instrText xml:space="preserve"> NUMPAGES </w:instrText>
     </w:r>
     <w:r>
+      <w:rPr>
+        <w:sz w:val="22"/>
+        <w:szCs w:val="22"/>
+      </w:rPr>
       <w:fldChar w:fldCharType="separate"/>
     </w:r>
     <w:r>
+      <w:rPr>
+        <w:sz w:val="22"/>
+        <w:szCs w:val="22"/>
+      </w:rPr>
       <w:t>1</w:t>
     </w:r>
     <w:r>
+      <w:rPr>
+        <w:sz w:val="22"/>
+        <w:szCs w:val="22"/>
+      </w:rPr>
       <w:fldChar w:fldCharType="end"/>
     </w:r>
   </w:p>
@@ -2089,7 +2005,7 @@
       </w:r>
     </w:p>
   </w:footnote>
-  <w:footnote w:id="11">
+  <w:footnote w:id="9">
     <w:p>
       <w:pPr>
         <w:pStyle w:val="FootnoteText"/>
@@ -2200,7 +2116,7 @@
   <w:docDefaults>
     <w:rPrDefault>
       <w:rPr>
-        <w:rFonts w:ascii="EB Garamond" w:hAnsi="EB Garamond" w:eastAsia="EB Garamond" w:cs="EB Garamond"/>
+        <w:rFonts w:ascii="Times New Roman" w:hAnsi="Times New Roman" w:eastAsia="Times New Roman" w:cs="Times New Roman"/>
         <w:sz w:val="24"/>
         <w:szCs w:val="24"/>
         <w:lang w:val="en-US" w:eastAsia="zh-CN" w:bidi="ar-SA"/>
@@ -2208,11 +2124,40 @@
     </w:rPrDefault>
     <w:pPrDefault>
       <w:pPr>
-        <w:spacing w:before="0" w:after="0" w:line="240" w:lineRule="auto"/>
+        <w:widowControl/>
+        <w:spacing w:after="0"/>
       </w:pPr>
     </w:pPrDefault>
   </w:docDefaults>
   <w:latentStyles w:defLockedState="0" w:defUIPriority="0" w:defSemiHidden="0" w:defUnhideWhenUsed="0" w:defQFormat="0" w:count="276"/>
+  <w:style w:type="paragraph" w:default="1" w:styleId="Normal">
+    <w:name w:val="Normal"/>
+    <w:qFormat/>
+  </w:style>
+  <w:style w:type="paragraph" w:styleId="BodyText">
+    <w:name w:val="Body Text"/>
+    <w:basedOn w:val="Normal"/>
+    <w:link w:val="BodyTextChar"/>
+    <w:qFormat/>
+    <w:pPr>
+      <w:spacing w:before="0" w:after="0" w:line="480" w:lineRule="exact"/>
+      <w:ind w:firstLine="720"/>
+    </w:pPr>
+  </w:style>
+  <w:style w:type="paragraph" w:customStyle="1" w:styleId="FirstParagraph">
+    <w:name w:val="First Paragraph"/>
+    <w:basedOn w:val="BodyText"/>
+    <w:next w:val="BodyText"/>
+    <w:qFormat/>
+  </w:style>
+  <w:style w:type="paragraph" w:customStyle="1" w:styleId="Compact">
+    <w:name w:val="Compact"/>
+    <w:basedOn w:val="BodyText"/>
+    <w:qFormat/>
+    <w:pPr>
+      <w:spacing w:before="36" w:after="36"/>
+    </w:pPr>
+  </w:style>
   <w:style w:type="paragraph" w:styleId="Title">
     <w:name w:val="Title"/>
     <w:basedOn w:val="Normal"/>
@@ -2346,6 +2291,69 @@
     <w:pPr/>
     <w:rPr/>
   </w:style>
+  <w:style w:type="paragraph" w:styleId="Heading1">
+    <w:name w:val="heading 1"/>
+    <w:basedOn w:val="Normal"/>
+    <w:next w:val="BodyText"/>
+    <w:qFormat/>
+    <w:pPr>
+      <w:keepNext/>
+      <w:keepLines/>
+      <w:spacing w:before="240" w:after="0" w:line="480" w:lineRule="exact"/>
+      <w:ind w:firstLine="0"/>
+      <w:jc w:val="center"/>
+      <w:outlineLvl w:val="0"/>
+    </w:pPr>
+    <w:rPr>
+      <w:b/>
+      <w:bCs/>
+      <w:color w:val="000000"/>
+      <w:sz w:val="24"/>
+      <w:szCs w:val="24"/>
+    </w:rPr>
+  </w:style>
+  <w:style w:type="paragraph" w:styleId="Heading2">
+    <w:name w:val="heading 2"/>
+    <w:basedOn w:val="Normal"/>
+    <w:next w:val="BodyText"/>
+    <w:qFormat/>
+    <w:pPr>
+      <w:keepNext/>
+      <w:keepLines/>
+      <w:spacing w:before="0" w:after="0" w:line="480" w:lineRule="exact"/>
+      <w:ind w:firstLine="0"/>
+      <w:jc w:val="center"/>
+      <w:outlineLvl w:val="1"/>
+    </w:pPr>
+    <w:rPr>
+      <w:b/>
+      <w:bCs/>
+      <w:color w:val="000000"/>
+      <w:sz w:val="24"/>
+      <w:szCs w:val="24"/>
+    </w:rPr>
+  </w:style>
+  <w:style w:type="paragraph" w:styleId="Heading3">
+    <w:name w:val="heading 3"/>
+    <w:basedOn w:val="Normal"/>
+    <w:next w:val="BodyText"/>
+    <w:qFormat/>
+    <w:pPr>
+      <w:keepNext/>
+      <w:keepLines/>
+      <w:spacing w:before="0" w:after="0" w:line="480" w:lineRule="exact"/>
+      <w:ind w:firstLine="0"/>
+      <w:jc w:val="center"/>
+      <w:outlineLvl w:val="2"/>
+    </w:pPr>
+    <w:rPr>
+      <w:b/>
+      <w:bCs/>
+      <w:color w:val="000000"/>
+      <w:sz w:val="24"/>
+      <w:szCs w:val="24"/>
+    </w:rPr>
+  </w:style>
   <w:style w:type="paragraph" w:styleId="Heading4">
     <w:name w:val="heading 4"/>
     <w:basedOn w:val="Normal"/>
@@ -2359,14 +2367,18 @@
     <w:pPr>
       <w:keepNext/>
       <w:keepLines/>
-      <w:spacing w:before="80" w:after="40"/>
+      <w:spacing w:before="240" w:after="120" w:line="276" w:lineRule="exact"/>
+      <w:ind w:firstLine="0"/>
       <w:outlineLvl w:val="3"/>
     </w:pPr>
     <w:rPr>
-      <w:rFonts w:eastAsiaTheme="majorEastAsia" w:cstheme="majorBidi"/>
+      <w:rFonts w:ascii="Times New Roman" w:hAnsi="Times New Roman" w:eastAsia="Times New Roman" w:cs="Times New Roman"/>
+      <w:b/>
+      <w:bCs/>
       <w:i/>
-      <w:iCs/>
-      <w:color w:val="0F4761" w:themeColor="accent1" w:themeShade="BF"/>
+      <w:color w:val="000000"/>
+      <w:sz w:val="24"/>
+      <w:szCs w:val="24"/>
     </w:rPr>
   </w:style>
   <w:style w:type="paragraph" w:styleId="Heading5">
@@ -2382,12 +2394,18 @@
     <w:pPr>
       <w:keepNext/>
       <w:keepLines/>
-      <w:spacing w:before="80" w:after="40"/>
+      <w:spacing w:before="240" w:after="120" w:line="276" w:lineRule="exact"/>
+      <w:ind w:firstLine="0"/>
       <w:outlineLvl w:val="4"/>
     </w:pPr>
     <w:rPr>
-      <w:rFonts w:eastAsiaTheme="majorEastAsia" w:cstheme="majorBidi"/>
-      <w:color w:val="0F4761" w:themeColor="accent1" w:themeShade="BF"/>
+      <w:rFonts w:ascii="Times New Roman" w:hAnsi="Times New Roman" w:eastAsia="Times New Roman" w:cs="Times New Roman"/>
+      <w:b/>
+      <w:bCs/>
+      <w:i/>
+      <w:color w:val="000000"/>
+      <w:sz w:val="24"/>
+      <w:szCs w:val="24"/>
     </w:rPr>
   </w:style>
   <w:style w:type="paragraph" w:styleId="Heading6">
@@ -2597,6 +2615,43 @@
       <w:color w:val="272727" w:themeColor="text1" w:themeTint="D8"/>
     </w:rPr>
   </w:style>
+  <w:style w:type="paragraph" w:customStyle="1" w:styleId="ListItem">
+    <w:name w:val="List Item"/>
+    <w:basedOn w:val="BodyText"/>
+    <w:qFormat/>
+    <w:pPr>
+      <w:spacing w:before="0" w:after="0" w:line="480" w:lineRule="exact"/>
+      <w:ind w:left="720" w:hanging="720"/>
+    </w:pPr>
+  </w:style>
+  <w:style w:type="paragraph" w:styleId="BlockText">
+    <w:name w:val="Block Text"/>
+    <w:basedOn w:val="BodyText"/>
+    <w:next w:val="BodyText"/>
+    <w:uiPriority w:val="9"/>
+    <w:unhideWhenUsed/>
+    <w:qFormat/>
+    <w:pPr>
+      <w:spacing w:before="240" w:after="240" w:line="276" w:lineRule="exact"/>
+      <w:ind w:firstLine="0" w:left="720" w:right="720"/>
+    </w:pPr>
+  </w:style>
+  <w:style w:type="paragraph" w:styleId="FootnoteText">
+    <w:name w:val="Footnote Text"/>
+    <w:basedOn w:val="Normal"/>
+    <w:next w:val="FootnoteText"/>
+    <w:uiPriority w:val="9"/>
+    <w:unhideWhenUsed/>
+    <w:qFormat/>
+    <w:pPr>
+      <w:keepLines/>
+      <w:spacing w:before="0" w:after="120" w:line="230" w:lineRule="exact"/>
+    </w:pPr>
+    <w:rPr>
+      <w:sz w:val="20"/>
+      <w:szCs w:val="20"/>
+    </w:rPr>
+  </w:style>
   <w:style w:type="paragraph" w:styleId="FootnoteBlockText">
     <w:name w:val="Footnote Block Text"/>
     <w:basedOn w:val="FootnoteText"/>
@@ -2605,8 +2660,8 @@
     <w:unhideWhenUsed/>
     <w:qFormat/>
     <w:pPr>
-      <w:spacing w:before="100" w:after="100"/>
-      <w:ind w:firstLine="0" w:left="480" w:right="480"/>
+      <w:spacing w:before="240" w:after="240"/>
+      <w:ind w:firstLine="0" w:left="720" w:right="720"/>
     </w:pPr>
   </w:style>
   <w:style w:type="character" w:default="1" w:styleId="DefaultParagraphFont">
@@ -2714,7 +2769,7 @@
     <w:name w:val="Hyperlink"/>
     <w:basedOn w:val="BodyTextChar"/>
     <w:rPr>
-      <w:color w:val="4F81BD" w:themeColor="accent1"/>
+      <w:color w:val="000000"/>
     </w:rPr>
   </w:style>
   <w:style w:type="paragraph" w:styleId="TOCHeading">
@@ -2735,208 +2790,16 @@
       <w:color w:val="365F91" w:themeColor="accent1" w:themeShade="BF"/>
     </w:rPr>
   </w:style>
-  <w:style w:type="paragraph" w:default="1" w:styleId="Normal">
-    <w:name w:val="Normal"/>
+  <w:style w:type="paragraph" w:customStyle="1" w:styleId="BodyTextNote">
+    <w:name w:val="Body Text Note"/>
+    <w:basedOn w:val="BodyText"/>
     <w:qFormat/>
     <w:pPr>
-      <w:widowControl/>
-      <w:spacing w:before="0" w:after="0" w:line="240" w:lineRule="auto"/>
-      <w:ind w:firstLine="0"/>
-      <w:jc w:val="left"/>
+      <w:widowControl w:val="0"/>
     </w:pPr>
-    <w:rPr>
-      <w:rFonts w:ascii="EB Garamond" w:hAnsi="EB Garamond" w:eastAsia="EB Garamond" w:cs="EB Garamond"/>
-      <w:sz w:val="24"/>
-      <w:szCs w:val="24"/>
-    </w:rPr>
-  </w:style>
-  <w:style w:type="paragraph" w:styleId="BodyText">
-    <w:name w:val="Body Text"/>
-    <w:basedOn w:val="Normal"/>
-    <w:qFormat/>
-    <w:pPr>
-      <w:spacing w:before="0" w:after="0" w:line="480" w:lineRule="exact"/>
-      <w:ind w:firstLine="720"/>
-    </w:pPr>
-  </w:style>
-  <w:style w:type="paragraph" w:styleId="FirstParagraph">
-    <w:name w:val="First Paragraph"/>
-    <w:basedOn w:val="BodyText"/>
-    <w:next w:val="BodyText"/>
-    <w:qFormat/>
-  </w:style>
-  <w:style w:type="paragraph" w:customStyle="1" w:styleId="Compact">
-    <w:name w:val="Compact"/>
-    <w:basedOn w:val="BodyText"/>
-    <w:qFormat/>
-  </w:style>
-  <w:style w:type="paragraph" w:styleId="Heading1">
-    <w:name w:val="heading 1"/>
-    <w:basedOn w:val="Normal"/>
-    <w:next w:val="BodyText"/>
-    <w:uiPriority w:val="9"/>
-    <w:qFormat/>
-    <w:pPr>
-      <w:keepNext/>
-      <w:keepLines/>
-      <w:spacing w:before="0" w:after="0" w:line="480" w:lineRule="exact"/>
-      <w:ind w:firstLine="0"/>
-      <w:jc w:val="center"/>
-      <w:outlineLvl w:val="0"/>
-    </w:pPr>
-    <w:rPr>
-      <w:rFonts w:ascii="EB Garamond" w:hAnsi="EB Garamond" w:eastAsia="EB Garamond" w:cs="EB Garamond"/>
-      <w:b/>
-      <w:caps/>
-      <w:color w:val="000000"/>
-      <w:sz w:val="24"/>
-      <w:szCs w:val="24"/>
-    </w:rPr>
-  </w:style>
-  <w:style w:type="paragraph" w:styleId="Heading2">
-    <w:name w:val="heading 2"/>
-    <w:basedOn w:val="Normal"/>
-    <w:next w:val="BodyText"/>
-    <w:uiPriority w:val="9"/>
-    <w:unhideWhenUsed/>
-    <w:qFormat/>
-    <w:pPr>
-      <w:keepNext/>
-      <w:keepLines/>
-      <w:spacing w:before="0" w:after="0" w:line="480" w:lineRule="exact"/>
-      <w:ind w:firstLine="0"/>
-      <w:jc w:val="center"/>
-      <w:outlineLvl w:val="1"/>
-    </w:pPr>
-    <w:rPr>
-      <w:rFonts w:ascii="EB Garamond" w:hAnsi="EB Garamond" w:eastAsia="EB Garamond" w:cs="EB Garamond"/>
-      <w:b/>
-      <w:color w:val="000000"/>
-      <w:sz w:val="24"/>
-      <w:szCs w:val="24"/>
-    </w:rPr>
-  </w:style>
-  <w:style w:type="paragraph" w:styleId="Heading3">
-    <w:name w:val="heading 3"/>
-    <w:basedOn w:val="Normal"/>
-    <w:next w:val="BodyText"/>
-    <w:uiPriority w:val="9"/>
-    <w:unhideWhenUsed/>
-    <w:qFormat/>
-    <w:pPr>
-      <w:keepNext/>
-      <w:keepLines/>
-      <w:spacing w:before="0" w:after="0" w:line="480" w:lineRule="exact"/>
-      <w:ind w:firstLine="0"/>
-      <w:jc w:val="center"/>
-      <w:outlineLvl w:val="2"/>
-    </w:pPr>
-    <w:rPr>
-      <w:rFonts w:ascii="EB Garamond" w:hAnsi="EB Garamond" w:eastAsia="EB Garamond" w:cs="EB Garamond"/>
-      <w:b/>
-      <w:color w:val="000000"/>
-      <w:sz w:val="24"/>
-      <w:szCs w:val="24"/>
-    </w:rPr>
-  </w:style>
-  <w:style w:type="paragraph" w:styleId="BlockText">
-    <w:name w:val="Block Text"/>
-    <w:basedOn w:val="Normal"/>
-    <w:next w:val="BodyText"/>
-    <w:uiPriority w:val="9"/>
-    <w:unhideWhenUsed/>
-    <w:qFormat/>
-    <w:pPr>
-      <w:spacing w:before="0" w:after="0" w:line="276" w:lineRule="exact"/>
-      <w:ind w:left="720" w:right="720" w:firstLine="0"/>
-    </w:pPr>
-  </w:style>
-  <w:style w:type="paragraph" w:styleId="FootnoteText">
-    <w:name w:val="footnote text"/>
-    <w:basedOn w:val="Normal"/>
-    <w:next w:val="FootnoteText"/>
-    <w:uiPriority w:val="9"/>
-    <w:unhideWhenUsed/>
-    <w:qFormat/>
-    <w:pPr>
-      <w:spacing w:before="0" w:after="120" w:line="240" w:lineRule="auto"/>
-      <w:ind w:firstLine="0"/>
-    </w:pPr>
-    <w:rPr>
-      <w:sz w:val="20"/>
-      <w:szCs w:val="20"/>
-    </w:rPr>
-  </w:style>
-  <w:style w:type="paragraph" w:styleId="Footer">
-    <w:name w:val="footer"/>
-    <w:basedOn w:val="Normal"/>
-    <w:uiPriority w:val="99"/>
-    <w:unhideWhenUsed/>
-    <w:pPr>
-      <w:spacing w:before="0" w:after="0" w:line="240" w:lineRule="auto"/>
-      <w:ind w:firstLine="0"/>
-      <w:jc w:val="center"/>
-    </w:pPr>
-    <w:rPr>
-      <w:sz w:val="22"/>
-      <w:szCs w:val="22"/>
-    </w:rPr>
-  </w:style>
-  <w:style w:type="paragraph" w:customStyle="1" w:styleId="CourtTitle">
-    <w:name w:val="Court Title"/>
-    <w:basedOn w:val="Normal"/>
-    <w:qFormat/>
-    <w:pPr>
-      <w:keepNext/>
-      <w:spacing w:before="0" w:after="0" w:line="276" w:lineRule="exact"/>
-      <w:ind w:firstLine="0"/>
-      <w:jc w:val="center"/>
-    </w:pPr>
-    <w:rPr>
-      <w:b/>
-    </w:rPr>
-  </w:style>
-  <w:style w:type="paragraph" w:customStyle="1" w:styleId="CaptionText">
-    <w:name w:val="Caption Text"/>
-    <w:basedOn w:val="Normal"/>
-    <w:qFormat/>
-    <w:pPr>
-      <w:spacing w:before="0" w:after="0" w:line="276" w:lineRule="exact"/>
-      <w:ind w:firstLine="0"/>
-    </w:pPr>
-  </w:style>
-  <w:style w:type="paragraph" w:customStyle="1" w:styleId="CaptionDesignation">
-    <w:name w:val="Caption Designation"/>
-    <w:basedOn w:val="CaptionText"/>
-    <w:qFormat/>
-    <w:pPr>
-      <w:ind w:left="2304" w:firstLine="0"/>
-    </w:pPr>
-  </w:style>
-  <w:style w:type="paragraph" w:customStyle="1" w:styleId="CaptionCase">
-    <w:name w:val="Caption Case Info"/>
-    <w:basedOn w:val="CaptionText"/>
-    <w:qFormat/>
-    <w:pPr>
-      <w:ind w:left="504" w:firstLine="0"/>
-    </w:pPr>
-  </w:style>
-  <w:style w:type="paragraph" w:customStyle="1" w:styleId="PleadingTitle">
-    <w:name w:val="Pleading Title"/>
-    <w:basedOn w:val="Normal"/>
-    <w:qFormat/>
-    <w:pPr>
-      <w:keepNext/>
-      <w:spacing w:before="0" w:after="0" w:line="480" w:lineRule="exact"/>
-      <w:ind w:firstLine="0"/>
-      <w:jc w:val="center"/>
-    </w:pPr>
-    <w:rPr>
-      <w:b/>
-    </w:rPr>
-  </w:style>
-  <w:style w:type="paragraph" w:customStyle="1" w:styleId="Allegation">
-    <w:name w:val="Allegation"/>
+  </w:style>
+  <w:style w:type="paragraph" w:customStyle="1" w:styleId="NumberedParagraph">
+    <w:name w:val="Numbered Paragraph"/>
     <w:basedOn w:val="BodyText"/>
     <w:qFormat/>
     <w:pPr>
@@ -2945,6 +2808,14 @@
       </w:tabs>
       <w:spacing w:before="0" w:after="0" w:line="480" w:lineRule="exact"/>
       <w:ind w:firstLine="720"/>
+    </w:pPr>
+  </w:style>
+  <w:style w:type="paragraph" w:customStyle="1" w:styleId="NumberedParagraphNote">
+    <w:name w:val="Numbered Paragraph Note"/>
+    <w:basedOn w:val="NumberedParagraph"/>
+    <w:qFormat/>
+    <w:pPr>
+      <w:widowControl w:val="0"/>
     </w:pPr>
   </w:style>
   <w:style w:type="paragraph" w:customStyle="1" w:styleId="PleadingList">
@@ -2957,16 +2828,6 @@
       </w:tabs>
       <w:spacing w:before="0" w:after="0" w:line="480" w:lineRule="exact"/>
       <w:ind w:left="1584" w:hanging="864"/>
-    </w:pPr>
-  </w:style>
-  <w:style w:type="paragraph" w:customStyle="1" w:styleId="Signature">
-    <w:name w:val="Signature Block"/>
-    <w:basedOn w:val="CaptionText"/>
-    <w:qFormat/>
-    <w:pPr>
-      <w:keepNext/>
-      <w:keepLines/>
-      <w:ind w:left="4320" w:firstLine="0"/>
     </w:pPr>
   </w:style>
   <w:style w:type="paragraph" w:customStyle="1" w:styleId="SourceCode">

</xml_diff>